<commit_message>
barlow/finesst: v7 resolve PI's (reference) TODO + fix Summary parallelism
- (reference) placeholder on the energy-limited-valleys claim -> [9] Fountain
  et al. (1999), Physical controls on the Taylor Valley ecosystem; added to refs.
- Summary sentence: restore parallel verbs ("links ... widens ... attaches"),
  keeping the PI's remote-sensing + machine-learning wording.

Co-Authored-By: Claude Opus 4.8 (1M context) <noreply@anthropic.com>
</commit_message>
<xml_diff>
--- a/barlow/docs/finesst_proposal_v7.docx
+++ b/barlow/docs/finesst_proposal_v7.docx
@@ -19,7 +19,7 @@
     </w:p>
     <w:p>
       <w:r>
-        <w:t>Summary: Previous work [1] has identified places where Antarctic Dry Valley streams are reshaping the land, but it stops at location and doesn’t examine the causes of stream migration. This project attempts to elucidate the drivers of channel migration. Measured changes from remote sensing and machine learning will be linked to the driving processes (heat, melt, thawing ground), widen the measurement from the stream channels to the whole valley floor, and attach a real uncertainty value to every pixel.</w:t>
+        <w:t>Summary: Previous work [1] has identified places where Antarctic Dry Valley streams are reshaping the land, but it stops at location and doesn’t examine the causes of stream migration. This project attempts to elucidate the drivers of channel migration. Using remote sensing and machine learning, it links the measured changes to the driving processes (heat, melt, thawing ground), widens the measurement from the stream channels to the whole valley floor, and attaches a real uncertainty value to every pixel.</w:t>
       </w:r>
       <w:r/>
       <w:r/>
@@ -62,23 +62,13 @@
         </w:rPr>
       </w:pPr>
       <w:r>
-        <w:t xml:space="preserve">The McMurdo Dry Valleys (MDVs) are the largest ice-free region of Antarctica. For most of a century they were treated as one of Earth's most stable landscapes, lacking strong erosive forces. That view is now an open question. The valleys are energy-limited: ice is everywhere, </w:t>
-      </w:r>
-      <w:r>
-        <w:t>and</w:t>
-      </w:r>
-      <w:r>
-        <w:t xml:space="preserve"> </w:t>
-      </w:r>
-      <w:r>
-        <w:t>there is barely enough summer heat to melt much of it</w:t>
-      </w:r>
-      <w:r>
-        <w:t xml:space="preserve"> (reference)</w:t>
-      </w:r>
-      <w:r>
-        <w:t>. A small warming produces a measurable response — ephemeral streams (channels that flow only during a brief melt season) carry more water, move sediment, and reshape the terrain.</w:t>
-      </w:r>
+        <w:t>The McMurdo Dry Valleys (MDVs) are the largest ice-free region of Antarctica. For most of a century they were treated as one of Earth's most stable landscapes, lacking strong erosive forces. That view is now an open question. The valleys are energy-limited: ice is everywhere, and there is barely enough summer heat to melt much of it [9]. A small warming produces a measurable response — ephemeral streams (channels that flow only during a brief melt season) carry more water, move sediment, and reshape the terrain.</w:t>
+      </w:r>
+      <w:r/>
+      <w:r/>
+      <w:r/>
+      <w:r/>
+      <w:r/>
     </w:p>
     <w:p>
       <w:pPr>
@@ -1952,6 +1942,28 @@
           <w:rFonts w:ascii="Calibri" w:hAnsi="Calibri"/>
         </w:rPr>
         <w:t>[8] Schenk, T., Csatho, B., Ahn, Y., Yoon, T., Shin, S. W., &amp; Huh, K. I. (2004). DEM generation from the Antarctic LiDAR data: Site report. US Geological Survey.</w:t>
+      </w:r>
+      <w:r>
+        <w:rPr>
+          <w:rFonts w:ascii="Calibri" w:hAnsi="Calibri"/>
+          <w:i/>
+        </w:rPr>
+      </w:r>
+      <w:r>
+        <w:rPr>
+          <w:rFonts w:ascii="Calibri" w:hAnsi="Calibri"/>
+        </w:rPr>
+      </w:r>
+    </w:p>
+    <w:p>
+      <w:pPr>
+        <w:spacing w:after="120"/>
+      </w:pPr>
+      <w:r>
+        <w:rPr>
+          <w:rFonts w:ascii="Calibri" w:hAnsi="Calibri"/>
+        </w:rPr>
+        <w:t>[9] Fountain, A. G., et al. (1999). Physical controls on the Taylor Valley ecosystem, Antarctica. BioScience 49(12):961-971.</w:t>
       </w:r>
       <w:r>
         <w:rPr>

</xml_diff>